<commit_message>
Use the full Text Analysis Model in Chapters 17 and 25
- Ch17 Step 3: micro level (words, grammar, meaning, word forms, sound),
  macro level (text, other texts, point of view) and external level
- Ch17 Step 5: the model as a quality check; Ch25 Step 2: consult the
  analysis in the commentary
- Final report 5.5 and appendix 7.1 updated point by point

Co-Authored-By: Claude Opus 5.5 <noreply@anthropic.com>
Claude-Session: https://claude.ai/code/session_01VkNWz9zCVkDAANuF8jpQYy
</commit_message>
<xml_diff>
--- a/Handbook-Final-Report.docx
+++ b/Handbook-Final-Report.docx
@@ -3786,7 +3786,7 @@
         <w:rPr>
           <w:rFonts w:ascii="Arial" w:cs="Arial" w:eastAsia="Arial" w:hAnsi="Arial"/>
         </w:rPr>
-        <w:t xml:space="preserve">This document was seen only in a screenshot of its first page and the start of its second page (four pages in all). What was visible was used as follows.</w:t>
+        <w:t xml:space="preserve">All four pages were seen in screenshots. The model was shared in the Teams chat with notes from the Text Analysis and Translation course and three sample analyses.</w:t>
       </w:r>
     </w:p>
     <w:p>
@@ -3804,13 +3804,13 @@
           <w:b/>
           <w:bCs/>
         </w:rPr>
-        <w:t xml:space="preserve">Used and edited</w:t>
-      </w:r>
-      <w:r>
-        <w:rPr>
-          <w:rFonts w:ascii="Arial" w:cs="Arial" w:eastAsia="Arial" w:hAnsi="Arial"/>
-        </w:rPr>
-        <w:t xml:space="preserve"> in Chapter 17: the three-step process (analysis of the source text, translation, and the post-translation activity) matches the three phases already in the chapter (analysis, translation and commentary).</w:t>
+        <w:t xml:space="preserve">Used as written</w:t>
+      </w:r>
+      <w:r>
+        <w:rPr>
+          <w:rFonts w:ascii="Arial" w:cs="Arial" w:eastAsia="Arial" w:hAnsi="Arial"/>
+        </w:rPr>
+        <w:t xml:space="preserve">: the three-step process (analysis, translation, post-translation activity), which matches the three phases already in Chapters 17 and 25.</w:t>
       </w:r>
     </w:p>
     <w:p>
@@ -3834,7 +3834,7 @@
         <w:rPr>
           <w:rFonts w:ascii="Arial" w:cs="Arial" w:eastAsia="Arial" w:hAnsi="Arial"/>
         </w:rPr>
-        <w:t xml:space="preserve"> in Chapter 17, as a new Step 3, “look at two levels”: the </w:t>
+        <w:t xml:space="preserve"> in Chapter 17, Step 3 (“look at two levels”), in plain English: the </w:t>
       </w:r>
       <w:r>
         <w:rPr>
@@ -3848,7 +3848,7 @@
         <w:rPr>
           <w:rFonts w:ascii="Arial" w:cs="Arial" w:eastAsia="Arial" w:hAnsi="Arial"/>
         </w:rPr>
-        <w:t xml:space="preserve"> (words, grammar and meaning, from the model’s micro level: lexical, syntactic and semantic aspects) and the </w:t>
+        <w:t xml:space="preserve">, with its </w:t>
       </w:r>
       <w:r>
         <w:rPr>
@@ -3856,30 +3856,106 @@
           <w:b/>
           <w:bCs/>
         </w:rPr>
-        <w:t xml:space="preserve">external level</w:t>
-      </w:r>
-      <w:r>
-        <w:rPr>
-          <w:rFonts w:ascii="Arial" w:cs="Arial" w:eastAsia="Arial" w:hAnsi="Arial"/>
-        </w:rPr>
-        <w:t xml:space="preserve"> (aspects that affect the translation but are not visible in the words).</w:t>
-      </w:r>
-    </w:p>
-    <w:p>
-      <w:pPr>
-        <w:pStyle w:val="ListParagraph"/>
-        <w:numPr>
-          <w:ilvl w:val="0"/>
-          <w:numId w:val="2"/>
-        </w:numPr>
-        <w:spacing w:after="80" w:line="290"/>
-      </w:pPr>
+        <w:t xml:space="preserve">micro level</w:t>
+      </w:r>
+      <w:r>
+        <w:rPr>
+          <w:rFonts w:ascii="Arial" w:cs="Arial" w:eastAsia="Arial" w:hAnsi="Arial"/>
+        </w:rPr>
+        <w:t xml:space="preserve"> (lexical, syntactic, semantic, morphological and phonological aspects, given as words, grammar, meaning, word forms and sound) and its </w:t>
+      </w:r>
       <w:r>
         <w:rPr>
           <w:rFonts w:ascii="Arial" w:cs="Arial" w:eastAsia="Arial" w:hAnsi="Arial"/>
           <w:b/>
           <w:bCs/>
         </w:rPr>
+        <w:t xml:space="preserve">macro level</w:t>
+      </w:r>
+      <w:r>
+        <w:rPr>
+          <w:rFonts w:ascii="Arial" w:cs="Arial" w:eastAsia="Arial" w:hAnsi="Arial"/>
+        </w:rPr>
+        <w:t xml:space="preserve"> (textual, intertextual, and political or ideological aspects, given as the text, other texts, and point of view, linked to Chapters 18 and 19); and the </w:t>
+      </w:r>
+      <w:r>
+        <w:rPr>
+          <w:rFonts w:ascii="Arial" w:cs="Arial" w:eastAsia="Arial" w:hAnsi="Arial"/>
+          <w:b/>
+          <w:bCs/>
+        </w:rPr>
+        <w:t xml:space="preserve">external level</w:t>
+      </w:r>
+      <w:r>
+        <w:rPr>
+          <w:rFonts w:ascii="Arial" w:cs="Arial" w:eastAsia="Arial" w:hAnsi="Arial"/>
+        </w:rPr>
+        <w:t xml:space="preserve"> (the background event, the author, and the effect of the target culture and audience), given as three questions.</w:t>
+      </w:r>
+    </w:p>
+    <w:p>
+      <w:pPr>
+        <w:pStyle w:val="ListParagraph"/>
+        <w:numPr>
+          <w:ilvl w:val="0"/>
+          <w:numId w:val="2"/>
+        </w:numPr>
+        <w:spacing w:after="80" w:line="290"/>
+      </w:pPr>
+      <w:r>
+        <w:rPr>
+          <w:rFonts w:ascii="Arial" w:cs="Arial" w:eastAsia="Arial" w:hAnsi="Arial"/>
+          <w:b/>
+          <w:bCs/>
+        </w:rPr>
+        <w:t xml:space="preserve">Used and edited</w:t>
+      </w:r>
+      <w:r>
+        <w:rPr>
+          <w:rFonts w:ascii="Arial" w:cs="Arial" w:eastAsia="Arial" w:hAnsi="Arial"/>
+        </w:rPr>
+        <w:t xml:space="preserve"> in Chapter 25: the post-translation commentary should consult the analysis and explain how the problems were solved. One sentence added to Step 2.</w:t>
+      </w:r>
+    </w:p>
+    <w:p>
+      <w:pPr>
+        <w:pStyle w:val="ListParagraph"/>
+        <w:numPr>
+          <w:ilvl w:val="0"/>
+          <w:numId w:val="2"/>
+        </w:numPr>
+        <w:spacing w:after="80" w:line="290"/>
+      </w:pPr>
+      <w:r>
+        <w:rPr>
+          <w:rFonts w:ascii="Arial" w:cs="Arial" w:eastAsia="Arial" w:hAnsi="Arial"/>
+          <w:b/>
+          <w:bCs/>
+        </w:rPr>
+        <w:t xml:space="preserve">Used and edited</w:t>
+      </w:r>
+      <w:r>
+        <w:rPr>
+          <w:rFonts w:ascii="Arial" w:cs="Arial" w:eastAsia="Arial" w:hAnsi="Arial"/>
+        </w:rPr>
+        <w:t xml:space="preserve"> in Chapter 17, Step 5: the model can also be used to assess the quality of a translation (which elements were transferred and which were omitted). One sentence added, linked to Chapter 23.</w:t>
+      </w:r>
+    </w:p>
+    <w:p>
+      <w:pPr>
+        <w:pStyle w:val="ListParagraph"/>
+        <w:numPr>
+          <w:ilvl w:val="0"/>
+          <w:numId w:val="2"/>
+        </w:numPr>
+        <w:spacing w:after="80" w:line="290"/>
+      </w:pPr>
+      <w:r>
+        <w:rPr>
+          <w:rFonts w:ascii="Arial" w:cs="Arial" w:eastAsia="Arial" w:hAnsi="Arial"/>
+          <w:b/>
+          <w:bCs/>
+        </w:rPr>
         <w:t xml:space="preserve">Added to the References</w:t>
       </w:r>
       <w:r>
@@ -3900,7 +3976,7 @@
         <w:rPr>
           <w:rFonts w:ascii="Arial" w:cs="Arial" w:eastAsia="Arial" w:hAnsi="Arial"/>
         </w:rPr>
-        <w:t xml:space="preserve"> (Routledge), which the model names as its basis. The chapter cites it together with the team’s course materials.</w:t>
+        <w:t xml:space="preserve"> (Routledge), which the model names as its basis.</w:t>
       </w:r>
     </w:p>
     <w:p>
@@ -3924,7 +4000,31 @@
         <w:rPr>
           <w:rFonts w:ascii="Arial" w:cs="Arial" w:eastAsia="Arial" w:hAnsi="Arial"/>
         </w:rPr>
-        <w:t xml:space="preserve">, because it was not seen: the rest of the micro level, the full list of the external level, and pages 3 and 4. The external level in the chapter is described in general terms only (author, publisher, audience, purpose and situation), taken from the checklist that was already in the chapter.</w:t>
+        <w:t xml:space="preserve">, as too advanced for beginners: blending, clippings and infixation; frame-modification, re-modelling and Al-ta’reed; politicization and ideologization as named terms; monitoring, intrinsic managing and extrinsic managing in the commentary.</w:t>
+      </w:r>
+    </w:p>
+    <w:p>
+      <w:pPr>
+        <w:pStyle w:val="ListParagraph"/>
+        <w:numPr>
+          <w:ilvl w:val="0"/>
+          <w:numId w:val="2"/>
+        </w:numPr>
+        <w:spacing w:after="80" w:line="290"/>
+      </w:pPr>
+      <w:r>
+        <w:rPr>
+          <w:rFonts w:ascii="Arial" w:cs="Arial" w:eastAsia="Arial" w:hAnsi="Arial"/>
+          <w:b/>
+          <w:bCs/>
+        </w:rPr>
+        <w:t xml:space="preserve">Not received</w:t>
+      </w:r>
+      <w:r>
+        <w:rPr>
+          <w:rFonts w:ascii="Arial" w:cs="Arial" w:eastAsia="Arial" w:hAnsi="Arial"/>
+        </w:rPr>
+        <w:t xml:space="preserve">: the course notes and the three sample analyses (the News text, the Speech text and the Climate change text). They could give Chapters 17 and 25 authentic worked examples.</w:t>
       </w:r>
     </w:p>
     <w:p>
@@ -5546,7 +5646,102 @@
                 <w:sz w:val="19"/>
                 <w:szCs w:val="19"/>
               </w:rPr>
-              <w:t xml:space="preserve">To be verified: only pages 1–2 were seen; author and full text to be confirmed</w:t>
+              <w:t xml:space="preserve">Checked: all four pages seen; the author is to be confirmed</w:t>
+            </w:r>
+          </w:p>
+        </w:tc>
+      </w:tr>
+      <w:tr>
+        <w:trPr>
+          <w:cantSplit/>
+        </w:trPr>
+        <w:tc>
+          <w:tcPr>
+            <w:tcW w:type="dxa" w:w="3991"/>
+            <w:tcBorders>
+              <w:top w:val="single" w:color="000000" w:sz="4"/>
+              <w:left w:val="single" w:color="000000" w:sz="4"/>
+              <w:bottom w:val="single" w:color="000000" w:sz="4"/>
+              <w:right w:val="single" w:color="000000" w:sz="4"/>
+            </w:tcBorders>
+            <w:tcMar>
+              <w:top w:type="dxa" w:w="60"/>
+              <w:left w:type="dxa" w:w="100"/>
+              <w:bottom w:type="dxa" w:w="60"/>
+              <w:right w:type="dxa" w:w="100"/>
+            </w:tcMar>
+          </w:tcPr>
+          <w:p>
+            <w:pPr>
+              <w:spacing w:after="0" w:line="260"/>
+            </w:pPr>
+            <w:r>
+              <w:rPr>
+                <w:rFonts w:ascii="Arial" w:cs="Arial" w:eastAsia="Arial" w:hAnsi="Arial"/>
+                <w:sz w:val="19"/>
+                <w:szCs w:val="19"/>
+              </w:rPr>
+              <w:t xml:space="preserve">Sample analyses (News, Speech and Climate change texts) and the Text Analysis and Translation course notes</w:t>
+            </w:r>
+          </w:p>
+        </w:tc>
+        <w:tc>
+          <w:tcPr>
+            <w:tcW w:type="dxa" w:w="1814"/>
+            <w:tcBorders>
+              <w:top w:val="single" w:color="000000" w:sz="4"/>
+              <w:left w:val="single" w:color="000000" w:sz="4"/>
+              <w:bottom w:val="single" w:color="000000" w:sz="4"/>
+              <w:right w:val="single" w:color="000000" w:sz="4"/>
+            </w:tcBorders>
+            <w:tcMar>
+              <w:top w:type="dxa" w:w="60"/>
+              <w:left w:type="dxa" w:w="100"/>
+              <w:bottom w:type="dxa" w:w="60"/>
+              <w:right w:type="dxa" w:w="100"/>
+            </w:tcMar>
+          </w:tcPr>
+          <w:p>
+            <w:pPr>
+              <w:spacing w:after="0" w:line="260"/>
+            </w:pPr>
+            <w:r>
+              <w:rPr>
+                <w:rFonts w:ascii="Arial" w:cs="Arial" w:eastAsia="Arial" w:hAnsi="Arial"/>
+                <w:sz w:val="19"/>
+                <w:szCs w:val="19"/>
+              </w:rPr>
+              <w:t xml:space="preserve">No</w:t>
+            </w:r>
+          </w:p>
+        </w:tc>
+        <w:tc>
+          <w:tcPr>
+            <w:tcW w:type="dxa" w:w="3266"/>
+            <w:tcBorders>
+              <w:top w:val="single" w:color="000000" w:sz="4"/>
+              <w:left w:val="single" w:color="000000" w:sz="4"/>
+              <w:bottom w:val="single" w:color="000000" w:sz="4"/>
+              <w:right w:val="single" w:color="000000" w:sz="4"/>
+            </w:tcBorders>
+            <w:tcMar>
+              <w:top w:type="dxa" w:w="60"/>
+              <w:left w:type="dxa" w:w="100"/>
+              <w:bottom w:type="dxa" w:w="60"/>
+              <w:right w:type="dxa" w:w="100"/>
+            </w:tcMar>
+          </w:tcPr>
+          <w:p>
+            <w:pPr>
+              <w:spacing w:after="0" w:line="260"/>
+            </w:pPr>
+            <w:r>
+              <w:rPr>
+                <w:rFonts w:ascii="Arial" w:cs="Arial" w:eastAsia="Arial" w:hAnsi="Arial"/>
+                <w:sz w:val="19"/>
+                <w:szCs w:val="19"/>
+              </w:rPr>
+              <w:t xml:space="preserve">Not received</w:t>
             </w:r>
           </w:p>
         </w:tc>
@@ -11288,7 +11483,24 @@
           <w:rFonts w:ascii="Arial" w:cs="Arial" w:eastAsia="Arial" w:hAnsi="Arial"/>
           <w:color w:val="C00000"/>
         </w:rPr>
-        <w:t xml:space="preserve">Send the full Text Analysis Model V2-2 (four pages) and name its author, so that Chapter 17 can be checked against the whole model and credited correctly.</w:t>
+        <w:t xml:space="preserve">Name the author of the Text Analysis Model V2-2, so that it can be credited correctly (it is now cited as the team’s course materials, with Fairclough, 2003).</w:t>
+      </w:r>
+    </w:p>
+    <w:p>
+      <w:pPr>
+        <w:pStyle w:val="ListParagraph"/>
+        <w:numPr>
+          <w:ilvl w:val="0"/>
+          <w:numId w:val="2"/>
+        </w:numPr>
+        <w:spacing w:after="80" w:line="290"/>
+      </w:pPr>
+      <w:r>
+        <w:rPr>
+          <w:rFonts w:ascii="Arial" w:cs="Arial" w:eastAsia="Arial" w:hAnsi="Arial"/>
+          <w:color w:val="C00000"/>
+        </w:rPr>
+        <w:t xml:space="preserve">Send the three sample analyses (News, Speech and Climate change texts) if they should be used as worked examples in Chapters 17 and 25.</w:t>
       </w:r>
     </w:p>
     <w:p>

</xml_diff>

<commit_message>
Add Contributors list and Contributions Report
- Handbook: Contributors list after the acknowledgements; compact
  contents page (fits on one page again); 98 pages
- New Handbook-Contributions-Report.docx: what was taken from each
  member, what was left out and why, what was removed, and the
  editor's assessment
- Final report: credit item updated

Co-Authored-By: Claude Opus 5.5 <noreply@anthropic.com>
Claude-Session: https://claude.ai/code/session_01VkNWz9zCVkDAANuF8jpQYy
</commit_message>
<xml_diff>
--- a/Handbook-Final-Report.docx
+++ b/Handbook-Final-Report.docx
@@ -610,7 +610,21 @@
         <w:rPr>
           <w:rFonts w:ascii="Arial" w:cs="Arial" w:eastAsia="Arial" w:hAnsi="Arial"/>
         </w:rPr>
-        <w:t xml:space="preserve">The abbreviations moved to the back of the book; the acknowledgements now close the preface.</w:t>
+        <w:t xml:space="preserve">The abbreviations moved to the back of the book; the acknowledgements and a new </w:t>
+      </w:r>
+      <w:r>
+        <w:rPr>
+          <w:rFonts w:ascii="Arial" w:cs="Arial" w:eastAsia="Arial" w:hAnsi="Arial"/>
+          <w:b/>
+          <w:bCs/>
+        </w:rPr>
+        <w:t xml:space="preserve">Contributors</w:t>
+      </w:r>
+      <w:r>
+        <w:rPr>
+          <w:rFonts w:ascii="Arial" w:cs="Arial" w:eastAsia="Arial" w:hAnsi="Arial"/>
+        </w:rPr>
+        <w:t xml:space="preserve"> list now close the preface.</w:t>
       </w:r>
     </w:p>
     <w:p>
@@ -4073,7 +4087,7 @@
         <w:rPr>
           <w:rFonts w:ascii="Arial" w:cs="Arial" w:eastAsia="Arial" w:hAnsi="Arial"/>
         </w:rPr>
-        <w:t xml:space="preserve">: the chat says that the material was selected from the terminology part by Samiuallah and Masooma. The handbook does not name individual contributors; the acknowledgement thanks every team member (see Section 7).</w:t>
+        <w:t xml:space="preserve">: the chat says that the material was selected from the terminology part by Samiuallah and Masooma. Both are now named on the Contributors page (see Section 7).</w:t>
       </w:r>
     </w:p>
     <w:p>
@@ -11580,7 +11594,7 @@
           <w:rFonts w:ascii="Arial" w:cs="Arial" w:eastAsia="Arial" w:hAnsi="Arial"/>
           <w:color w:val="C00000"/>
         </w:rPr>
-        <w:t xml:space="preserve">Credit the team members’ contributions: the Teams chat shows that Samiuallah and Masooma selected the terminology material, and that the audiovisual notes appear to be Loulwah’s. The handbook currently thanks all team members without names.</w:t>
+        <w:t xml:space="preserve">Confirm the names and roles on the new Contributors page (page iv): Shaikhah Alkhaledi, Loulwah Saeed, Masooma Almesri and Samiuallah Mohammad. The full account is in the Contributions Report.</w:t>
       </w:r>
     </w:p>
     <w:p>

</xml_diff>

<commit_message>
Compact layout: 102 to 92 pages with the same content
Chapters follow on from each other (parts still start a new page), the
glossary is in two columns, and margins and paragraph spacing are
slightly smaller. LOOSE=1 rebuilds the earlier layout.

Co-Authored-By: Claude Opus 5.5 <noreply@anthropic.com>
Claude-Session: https://claude.ai/code/session_01VkNWz9zCVkDAANuF8jpQYy
</commit_message>
<xml_diff>
--- a/Handbook-Final-Report.docx
+++ b/Handbook-Final-Report.docx
@@ -319,7 +319,7 @@
         <w:rPr>
           <w:rFonts w:ascii="Arial" w:cs="Arial" w:eastAsia="Arial" w:hAnsi="Arial"/>
         </w:rPr>
-        <w:t xml:space="preserve">102 pages, B5 size, in two editions with identical content: the </w:t>
+        <w:t xml:space="preserve">92 pages, B5 size, in two editions with identical content: the </w:t>
       </w:r>
       <w:r>
         <w:rPr>
@@ -1196,6 +1196,30 @@
           <w:rFonts w:ascii="Arial" w:cs="Arial" w:eastAsia="Arial" w:hAnsi="Arial"/>
         </w:rPr>
         <w:t xml:space="preserve">: the one example tied to a recent event was replaced with a general one.</w:t>
+      </w:r>
+    </w:p>
+    <w:p>
+      <w:pPr>
+        <w:pStyle w:val="ListParagraph"/>
+        <w:numPr>
+          <w:ilvl w:val="0"/>
+          <w:numId w:val="2"/>
+        </w:numPr>
+        <w:spacing w:after="80" w:line="290"/>
+      </w:pPr>
+      <w:r>
+        <w:rPr>
+          <w:rFonts w:ascii="Arial" w:cs="Arial" w:eastAsia="Arial" w:hAnsi="Arial"/>
+          <w:b/>
+          <w:bCs/>
+        </w:rPr>
+        <w:t xml:space="preserve">A shorter book without cutting content</w:t>
+      </w:r>
+      <w:r>
+        <w:rPr>
+          <w:rFonts w:ascii="Arial" w:cs="Arial" w:eastAsia="Arial" w:hAnsi="Arial"/>
+        </w:rPr>
+        <w:t xml:space="preserve">: chapters now follow on from each other, while each part still starts on a new page; the glossary is set in two columns; the margins and the space between paragraphs were reduced slightly. The book went from 102 to 92 pages with the same content.</w:t>
       </w:r>
     </w:p>
     <w:p>

</xml_diff>